<commit_message>
Alterei a mensagem no Main()
</commit_message>
<xml_diff>
--- a/ResumoGitHubIntelliJ.docx
+++ b/ResumoGitHubIntelliJ.docx
@@ -763,259 +763,215 @@
     <w:p>
       <w:pPr>
         <w:ind w:left="1080"/>
-      </w:pPr>
+        <w:rPr>
+          <w:b/>
+          <w:bCs/>
+          <w:lang w:val="en-US"/>
+        </w:rPr>
+      </w:pPr>
+      <w:r>
+        <w:rPr>
+          <w:b/>
+          <w:bCs/>
+          <w:lang w:val="en-US"/>
+        </w:rPr>
+        <w:t>Git -&gt; Push -&gt; master – Define remote</w:t>
+      </w:r>
+      <w:r>
+        <w:rPr>
+          <w:b/>
+          <w:bCs/>
+          <w:lang w:val="en-US"/>
+        </w:rPr>
+        <w:t xml:space="preserve"> -&gt; URL (</w:t>
+      </w:r>
       <w:proofErr w:type="spellStart"/>
       <w:r>
         <w:rPr>
           <w:b/>
           <w:bCs/>
-        </w:rPr>
-        <w:t>Git</w:t>
+          <w:lang w:val="en-US"/>
+        </w:rPr>
+        <w:t>inserir</w:t>
       </w:r>
       <w:proofErr w:type="spellEnd"/>
       <w:r>
         <w:rPr>
           <w:b/>
           <w:bCs/>
-        </w:rPr>
-        <w:t xml:space="preserve"> -&gt; </w:t>
+          <w:lang w:val="en-US"/>
+        </w:rPr>
+        <w:t xml:space="preserve"> URL do </w:t>
       </w:r>
       <w:proofErr w:type="spellStart"/>
       <w:r>
         <w:rPr>
           <w:b/>
           <w:bCs/>
-        </w:rPr>
-        <w:t>Push</w:t>
+          <w:lang w:val="en-US"/>
+        </w:rPr>
+        <w:t>repositório</w:t>
       </w:r>
       <w:proofErr w:type="spellEnd"/>
       <w:r>
         <w:rPr>
           <w:b/>
           <w:bCs/>
-        </w:rPr>
-        <w:t xml:space="preserve"> -&gt; </w:t>
+          <w:lang w:val="en-US"/>
+        </w:rPr>
+        <w:t xml:space="preserve"> </w:t>
       </w:r>
       <w:proofErr w:type="spellStart"/>
       <w:r>
         <w:rPr>
           <w:b/>
           <w:bCs/>
-        </w:rPr>
-        <w:t>master</w:t>
+          <w:lang w:val="en-US"/>
+        </w:rPr>
+        <w:t>remoto</w:t>
       </w:r>
       <w:proofErr w:type="spellEnd"/>
       <w:r>
         <w:rPr>
           <w:b/>
           <w:bCs/>
-        </w:rPr>
-        <w:t xml:space="preserve"> – Define </w:t>
+          <w:lang w:val="en-US"/>
+        </w:rPr>
+        <w:t>)</w:t>
+      </w:r>
+      <w:r>
+        <w:rPr>
+          <w:b/>
+          <w:bCs/>
+          <w:lang w:val="en-US"/>
+        </w:rPr>
+        <w:t xml:space="preserve"> -&gt; Push anyway -&gt; Log in</w:t>
+      </w:r>
+      <w:r>
+        <w:rPr>
+          <w:b/>
+          <w:bCs/>
+          <w:lang w:val="en-US"/>
+        </w:rPr>
+        <w:t xml:space="preserve"> via GitHub (</w:t>
       </w:r>
       <w:proofErr w:type="spellStart"/>
       <w:r>
         <w:rPr>
           <w:b/>
           <w:bCs/>
-        </w:rPr>
-        <w:t>remote</w:t>
+          <w:lang w:val="en-US"/>
+        </w:rPr>
+        <w:t>dar</w:t>
       </w:r>
       <w:proofErr w:type="spellEnd"/>
       <w:r>
         <w:rPr>
           <w:b/>
           <w:bCs/>
-        </w:rPr>
-        <w:t xml:space="preserve"> -&gt; URL (</w:t>
-      </w:r>
-      <w:r>
-        <w:rPr>
-          <w:b/>
-          <w:bCs/>
-        </w:rPr>
-        <w:t>inserir URL do repositório r</w:t>
-      </w:r>
-      <w:r>
-        <w:rPr>
-          <w:b/>
-          <w:bCs/>
-        </w:rPr>
-        <w:t>emoto)</w:t>
+          <w:lang w:val="en-US"/>
+        </w:rPr>
+        <w:t xml:space="preserve"> </w:t>
+      </w:r>
+      <w:proofErr w:type="spellStart"/>
+      <w:r>
+        <w:rPr>
+          <w:b/>
+          <w:bCs/>
+          <w:lang w:val="en-US"/>
+        </w:rPr>
+        <w:t>autorização</w:t>
+      </w:r>
+      <w:proofErr w:type="spellEnd"/>
+      <w:r>
+        <w:rPr>
+          <w:b/>
+          <w:bCs/>
+          <w:lang w:val="en-US"/>
+        </w:rPr>
+        <w:t>)</w:t>
       </w:r>
     </w:p>
     <w:p>
       <w:pPr>
-        <w:ind w:left="1080"/>
+        <w:ind w:left="360"/>
+        <w:rPr>
+          <w:lang w:val="en-US"/>
+        </w:rPr>
       </w:pPr>
     </w:p>
     <w:p>
       <w:pPr>
         <w:ind w:left="360"/>
         <w:rPr>
-          <w:lang w:val="en-US"/>
-        </w:rPr>
-      </w:pPr>
-      <w:r>
-        <w:rPr>
-          <w:lang w:val="en-US"/>
-        </w:rPr>
-        <w:tab/>
-        <w:t xml:space="preserve">&gt; Share </w:t>
-      </w:r>
-      <w:proofErr w:type="gramStart"/>
-      <w:r>
-        <w:rPr>
-          <w:lang w:val="en-US"/>
-        </w:rPr>
-        <w:t>by:…</w:t>
-      </w:r>
-      <w:proofErr w:type="gramEnd"/>
-      <w:r>
-        <w:rPr>
-          <w:lang w:val="en-US"/>
-        </w:rPr>
-        <w:t>.. (</w:t>
-      </w:r>
-      <w:proofErr w:type="spellStart"/>
-      <w:r>
-        <w:rPr>
-          <w:lang w:val="en-US"/>
-        </w:rPr>
-        <w:t>Escolher</w:t>
-      </w:r>
-      <w:proofErr w:type="spellEnd"/>
-      <w:r>
-        <w:rPr>
-          <w:lang w:val="en-US"/>
-        </w:rPr>
-        <w:t xml:space="preserve"> Git hub </w:t>
-      </w:r>
-      <w:proofErr w:type="spellStart"/>
-      <w:r>
-        <w:rPr>
-          <w:lang w:val="en-US"/>
-        </w:rPr>
-        <w:t>em</w:t>
-      </w:r>
-      <w:proofErr w:type="spellEnd"/>
-      <w:r>
-        <w:rPr>
-          <w:lang w:val="en-US"/>
-        </w:rPr>
-        <w:t xml:space="preserve"> Add account)</w:t>
+          <w:b/>
+          <w:bCs/>
+        </w:rPr>
+      </w:pPr>
+      <w:r>
+        <w:rPr>
+          <w:b/>
+          <w:bCs/>
+        </w:rPr>
+        <w:t>Resumo simples (sem consola)</w:t>
       </w:r>
     </w:p>
     <w:p>
       <w:pPr>
         <w:ind w:left="360"/>
-        <w:rPr>
-          <w:lang w:val="en-US"/>
-        </w:rPr>
-      </w:pPr>
+      </w:pPr>
+      <w:r>
+        <w:t xml:space="preserve">Criar </w:t>
+      </w:r>
+      <w:proofErr w:type="spellStart"/>
+      <w:r>
+        <w:t>repo</w:t>
+      </w:r>
+      <w:proofErr w:type="spellEnd"/>
+      <w:r>
+        <w:t xml:space="preserve"> no GitHub</w:t>
+      </w:r>
     </w:p>
     <w:p>
       <w:pPr>
         <w:ind w:left="360"/>
-        <w:rPr>
-          <w:lang w:val="en-US"/>
-        </w:rPr>
-      </w:pPr>
-      <w:r>
-        <w:rPr>
-          <w:lang w:val="en-US"/>
-        </w:rPr>
-        <w:t xml:space="preserve">&gt; </w:t>
+      </w:pPr>
+      <w:r>
+        <w:t xml:space="preserve">Criar projeto no </w:t>
       </w:r>
       <w:proofErr w:type="spellStart"/>
       <w:r>
-        <w:rPr>
-          <w:lang w:val="en-US"/>
-        </w:rPr>
-        <w:t>Confirmar</w:t>
-      </w:r>
-      <w:proofErr w:type="spellEnd"/>
-      <w:r>
-        <w:rPr>
-          <w:lang w:val="en-US"/>
-        </w:rPr>
-        <w:t xml:space="preserve"> (Share)</w:t>
-      </w:r>
-    </w:p>
-    <w:p>
-      <w:pPr>
-        <w:ind w:left="360"/>
-      </w:pPr>
-      <w:r>
-        <w:t xml:space="preserve">&gt; </w:t>
-      </w:r>
-      <w:proofErr w:type="spellStart"/>
-      <w:r>
-        <w:t>Add</w:t>
-      </w:r>
-      <w:proofErr w:type="spellEnd"/>
-      <w:r>
-        <w:t xml:space="preserve"> Files: Selecionar todos o</w:t>
-      </w:r>
-      <w:r>
-        <w:t xml:space="preserve">s </w:t>
-      </w:r>
-      <w:proofErr w:type="spellStart"/>
-      <w:r>
-        <w:t>ficeheiros</w:t>
-      </w:r>
-      <w:proofErr w:type="spellEnd"/>
-      <w:r>
-        <w:t xml:space="preserve"> para o primeiro </w:t>
-      </w:r>
-      <w:proofErr w:type="spellStart"/>
-      <w:r>
-        <w:t>commit</w:t>
+        <w:t>IntelliJ</w:t>
       </w:r>
       <w:proofErr w:type="spellEnd"/>
     </w:p>
     <w:p>
       <w:pPr>
         <w:ind w:left="360"/>
-        <w:rPr>
-          <w:b/>
-          <w:bCs/>
-        </w:rPr>
-      </w:pPr>
-      <w:r>
-        <w:rPr>
-          <w:b/>
-          <w:bCs/>
-        </w:rPr>
-        <w:lastRenderedPageBreak/>
-        <w:t>Resumo simples (sem consola)</w:t>
-      </w:r>
-    </w:p>
-    <w:p>
-      <w:pPr>
-        <w:ind w:left="360"/>
-      </w:pPr>
-      <w:r>
-        <w:t xml:space="preserve">Criar </w:t>
-      </w:r>
+      </w:pPr>
       <w:proofErr w:type="spellStart"/>
       <w:r>
-        <w:t>repo</w:t>
+        <w:rPr>
+          <w:b/>
+          <w:bCs/>
+        </w:rPr>
+        <w:t>Enable</w:t>
       </w:r>
       <w:proofErr w:type="spellEnd"/>
       <w:r>
-        <w:t xml:space="preserve"> no GitHub</w:t>
-      </w:r>
-    </w:p>
-    <w:p>
-      <w:pPr>
-        <w:ind w:left="360"/>
-      </w:pPr>
-      <w:r>
-        <w:t xml:space="preserve">Criar projeto no </w:t>
+        <w:rPr>
+          <w:b/>
+          <w:bCs/>
+        </w:rPr>
+        <w:t xml:space="preserve"> </w:t>
       </w:r>
       <w:proofErr w:type="spellStart"/>
       <w:r>
-        <w:t>IntelliJ</w:t>
+        <w:rPr>
+          <w:b/>
+          <w:bCs/>
+        </w:rPr>
+        <w:t>Git</w:t>
       </w:r>
       <w:proofErr w:type="spellEnd"/>
     </w:p>
@@ -1023,13 +979,21 @@
       <w:pPr>
         <w:ind w:left="360"/>
       </w:pPr>
+      <w:r>
+        <w:rPr>
+          <w:b/>
+          <w:bCs/>
+        </w:rPr>
+        <w:lastRenderedPageBreak/>
+        <w:t xml:space="preserve">Share Project </w:t>
+      </w:r>
       <w:proofErr w:type="spellStart"/>
       <w:r>
         <w:rPr>
           <w:b/>
           <w:bCs/>
         </w:rPr>
-        <w:t>Enable</w:t>
+        <w:t>on</w:t>
       </w:r>
       <w:proofErr w:type="spellEnd"/>
       <w:r>
@@ -1037,61 +1001,34 @@
           <w:b/>
           <w:bCs/>
         </w:rPr>
-        <w:t xml:space="preserve"> </w:t>
-      </w:r>
+        <w:t xml:space="preserve"> GitHub</w:t>
+      </w:r>
+    </w:p>
+    <w:p>
+      <w:pPr>
+        <w:ind w:left="360"/>
+      </w:pPr>
+      <w:r>
+        <w:t>Usar:</w:t>
+      </w:r>
+    </w:p>
+    <w:p>
+      <w:pPr>
+        <w:ind w:left="1080"/>
+      </w:pPr>
       <w:proofErr w:type="spellStart"/>
       <w:r>
-        <w:rPr>
-          <w:b/>
-          <w:bCs/>
-        </w:rPr>
-        <w:t>Git</w:t>
+        <w:t>Commit</w:t>
       </w:r>
       <w:proofErr w:type="spellEnd"/>
     </w:p>
     <w:p>
       <w:pPr>
-        <w:ind w:left="360"/>
-      </w:pPr>
-      <w:r>
-        <w:rPr>
-          <w:b/>
-          <w:bCs/>
-        </w:rPr>
-        <w:t xml:space="preserve">Share Project </w:t>
-      </w:r>
+        <w:ind w:left="1080"/>
+      </w:pPr>
       <w:proofErr w:type="spellStart"/>
       <w:r>
-        <w:rPr>
-          <w:b/>
-          <w:bCs/>
-        </w:rPr>
-        <w:t>on</w:t>
-      </w:r>
-      <w:proofErr w:type="spellEnd"/>
-      <w:r>
-        <w:rPr>
-          <w:b/>
-          <w:bCs/>
-        </w:rPr>
-        <w:t xml:space="preserve"> GitHub</w:t>
-      </w:r>
-    </w:p>
-    <w:p>
-      <w:pPr>
-        <w:ind w:left="360"/>
-      </w:pPr>
-      <w:r>
-        <w:t>Usar:</w:t>
-      </w:r>
-    </w:p>
-    <w:p>
-      <w:pPr>
-        <w:ind w:left="1080"/>
-      </w:pPr>
-      <w:proofErr w:type="spellStart"/>
-      <w:r>
-        <w:t>Commit</w:t>
+        <w:t>Push</w:t>
       </w:r>
       <w:proofErr w:type="spellEnd"/>
     </w:p>
@@ -1099,9 +1036,17 @@
       <w:pPr>
         <w:ind w:left="1080"/>
       </w:pPr>
+      <w:r>
+        <w:t>Pull</w:t>
+      </w:r>
+    </w:p>
+    <w:p>
+      <w:pPr>
+        <w:ind w:left="1080"/>
+      </w:pPr>
       <w:proofErr w:type="spellStart"/>
       <w:r>
-        <w:t>Push</w:t>
+        <w:t>Branch</w:t>
       </w:r>
       <w:proofErr w:type="spellEnd"/>
     </w:p>
@@ -1109,24 +1054,6 @@
       <w:pPr>
         <w:ind w:left="1080"/>
       </w:pPr>
-      <w:r>
-        <w:t>Pull</w:t>
-      </w:r>
-    </w:p>
-    <w:p>
-      <w:pPr>
-        <w:ind w:left="1080"/>
-      </w:pPr>
-      <w:proofErr w:type="spellStart"/>
-      <w:r>
-        <w:t>Branch</w:t>
-      </w:r>
-      <w:proofErr w:type="spellEnd"/>
-    </w:p>
-    <w:p>
-      <w:pPr>
-        <w:ind w:left="1080"/>
-      </w:pPr>
       <w:proofErr w:type="spellStart"/>
       <w:r>
         <w:t>Merge</w:t>
@@ -1134,6 +1061,14 @@
       <w:proofErr w:type="spellEnd"/>
     </w:p>
     <w:p/>
+    <w:p>
+      <w:r>
+        <w:t xml:space="preserve">ver: </w:t>
+      </w:r>
+      <w:r>
+        <w:t>https://www.youtube.com/watch?v=s2Gfp2RkbbM</w:t>
+      </w:r>
+    </w:p>
     <w:sectPr>
       <w:pgSz w:w="11906" w:h="16838"/>
       <w:pgMar w:top="1417" w:right="1701" w:bottom="1417" w:left="1701" w:header="708" w:footer="708" w:gutter="0"/>

</xml_diff>